<commit_message>
Fix overflow crashes, stale custody checks and dropped additional provisions
- main.yml: compare legal/physical custody to the parties' full names (choice values changed in 79ac856), so the sole-custody reason and visitation questions are asked again
- Additional provisions now read the variables the review screens set (property statement, parenting plan overflow field)
- judgment overflow field is children_of_marriage_minor, matching the PDF and addendum
- addendum templates: no numeric format on the text SSN, fee waiver uses description_template, other-holiday rows no longer index role_dictionary_full_name with a name, Answer persons rows use name and address, petition addendum college key / names / literal markers
- al_income.matches(): name the returned list so DAObject skips inspect.stack()
- parenting plan review screen no longer assembles the whole PDF just to show one question

Not yet verified on a running server.

Co-Authored-By: Claude Sonnet 5.5 <noreply@anthropic.com>
</commit_message>
<xml_diff>
--- a/docassemble/MODivorceForms/data/templates/answer_attachment_addendum.docx
+++ b/docassemble/MODivorceForms/data/templates/answer_attachment_addendum.docx
@@ -1307,7 +1307,7 @@
                 <w:sz w:val="24"/>
                 <w:szCs w:val="24"/>
               </w:rPr>
-              <w:t>"{:.0f}".format(row.ssn)</w:t>
+              <w:t>''</w:t>
             </w:r>
             <w:r>
               <w:rPr>
@@ -1809,7 +1809,7 @@
                 <w:szCs w:val="24"/>
                 <w:lang w:val="en-US" w:eastAsia="en-US" w:bidi="ar-SA"/>
               </w:rPr>
-              <w:t>{{ format_date(row.birthdate, format='M/d/yyyy') }}</w:t>
+              <w:t>{{ row.address.on_one_line() }}</w:t>
             </w:r>
           </w:p>
         </w:tc>
@@ -1866,7 +1866,7 @@
                 <w:sz w:val="24"/>
                 <w:szCs w:val="24"/>
               </w:rPr>
-              <w:t>{{ "{:.0f}".format(row.ssn) }}</w:t>
+              <w:t/>
             </w:r>
           </w:p>
         </w:tc>

</xml_diff>

<commit_message>
fixed docx files and added visitation_reason
</commit_message>
<xml_diff>
--- a/docassemble/MODivorceForms/data/templates/answer_attachment_addendum.docx
+++ b/docassemble/MODivorceForms/data/templates/answer_attachment_addendum.docx
@@ -893,23 +893,7 @@
           <w:sz w:val="24"/>
           <w:szCs w:val="24"/>
         </w:rPr>
-        <w:t>{%p for field in answer_</w:t>
-      </w:r>
-      <w:r>
-        <w:rPr>
-          <w:rFonts w:ascii="Helvetica" w:hAnsi="Helvetica"/>
-          <w:sz w:val="24"/>
-          <w:szCs w:val="24"/>
-        </w:rPr>
-        <w:t>attachment</w:t>
-      </w:r>
-      <w:r>
-        <w:rPr>
-          <w:rFonts w:ascii="Helvetica" w:hAnsi="Helvetica"/>
-          <w:sz w:val="24"/>
-          <w:szCs w:val="24"/>
-        </w:rPr>
-        <w:t>[i].overflow() %}</w:t>
+        <w:t>{%p for field in answer_attachment[i].overflow() %}</w:t>
       </w:r>
       <w:bookmarkStart w:id="0" w:name="_GoBack"/>
       <w:bookmarkEnd w:id="0"/>
@@ -971,7 +955,7 @@
       </w:tblPr>
       <w:tblGrid>
         <w:gridCol w:w="4950"/>
-        <w:gridCol w:w="2610"/>
+        <w:gridCol w:w="2611"/>
         <w:gridCol w:w="1799"/>
       </w:tblGrid>
       <w:tr>
@@ -1009,7 +993,7 @@
         </w:tc>
         <w:tc>
           <w:tcPr>
-            <w:tcW w:w="2610" w:type="dxa"/>
+            <w:tcW w:w="2611" w:type="dxa"/>
             <w:tcBorders>
               <w:right w:val="nil"/>
             </w:tcBorders>
@@ -1108,7 +1092,7 @@
         </w:tc>
         <w:tc>
           <w:tcPr>
-            <w:tcW w:w="2610" w:type="dxa"/>
+            <w:tcW w:w="2611" w:type="dxa"/>
             <w:tcBorders>
               <w:right w:val="nil"/>
             </w:tcBorders>
@@ -1191,53 +1175,13 @@
                 <w:szCs w:val="24"/>
                 <w:lang w:val="en-US" w:eastAsia="en-US" w:bidi="ar-SA"/>
               </w:rPr>
-              <w:t xml:space="preserve">{{ </w:t>
-            </w:r>
-            <w:r>
-              <w:rPr>
-                <w:rFonts w:eastAsia="Calibri" w:cs="Arial" w:ascii="Helvetica" w:hAnsi="Helvetica"/>
-                <w:kern w:val="0"/>
-                <w:sz w:val="24"/>
-                <w:szCs w:val="24"/>
-                <w:lang w:val="en-US" w:eastAsia="en-US" w:bidi="ar-SA"/>
-              </w:rPr>
-              <w:t>redact(</w:t>
-            </w:r>
-            <w:r>
-              <w:rPr>
-                <w:rFonts w:eastAsia="Calibri" w:cs="Arial" w:ascii="Helvetica" w:hAnsi="Helvetica"/>
-                <w:kern w:val="0"/>
-                <w:sz w:val="24"/>
-                <w:szCs w:val="24"/>
-                <w:lang w:val="en-US" w:eastAsia="en-US" w:bidi="ar-SA"/>
-              </w:rPr>
-              <w:t>row.name.full()</w:t>
-            </w:r>
-            <w:r>
-              <w:rPr>
-                <w:rFonts w:eastAsia="Calibri" w:cs="Arial" w:ascii="Helvetica" w:hAnsi="Helvetica"/>
-                <w:kern w:val="0"/>
-                <w:sz w:val="24"/>
-                <w:szCs w:val="24"/>
-                <w:lang w:val="en-US" w:eastAsia="en-US" w:bidi="ar-SA"/>
-              </w:rPr>
-              <w:t>)</w:t>
-            </w:r>
-            <w:r>
-              <w:rPr>
-                <w:rFonts w:eastAsia="Calibri" w:cs="Arial" w:ascii="Helvetica" w:hAnsi="Helvetica"/>
-                <w:kern w:val="0"/>
-                <w:sz w:val="24"/>
-                <w:szCs w:val="24"/>
-                <w:lang w:val="en-US" w:eastAsia="en-US" w:bidi="ar-SA"/>
-              </w:rPr>
-              <w:t xml:space="preserve"> }}</w:t>
-            </w:r>
-          </w:p>
-        </w:tc>
-        <w:tc>
-          <w:tcPr>
-            <w:tcW w:w="2610" w:type="dxa"/>
+              <w:t>{{ redact(row.name.full()) }}</w:t>
+            </w:r>
+          </w:p>
+        </w:tc>
+        <w:tc>
+          <w:tcPr>
+            <w:tcW w:w="2611" w:type="dxa"/>
             <w:tcBorders>
               <w:right w:val="nil"/>
             </w:tcBorders>
@@ -1291,39 +1235,7 @@
                 <w:sz w:val="24"/>
                 <w:szCs w:val="24"/>
               </w:rPr>
-              <w:t xml:space="preserve">{{ </w:t>
-            </w:r>
-            <w:r>
-              <w:rPr>
-                <w:rFonts w:ascii="Helvetica" w:hAnsi="Helvetica"/>
-                <w:sz w:val="24"/>
-                <w:szCs w:val="24"/>
-              </w:rPr>
-              <w:t>redact(</w:t>
-            </w:r>
-            <w:r>
-              <w:rPr>
-                <w:rFonts w:ascii="Helvetica" w:hAnsi="Helvetica"/>
-                <w:sz w:val="24"/>
-                <w:szCs w:val="24"/>
-              </w:rPr>
-              <w:t>''</w:t>
-            </w:r>
-            <w:r>
-              <w:rPr>
-                <w:rFonts w:ascii="Helvetica" w:hAnsi="Helvetica"/>
-                <w:sz w:val="24"/>
-                <w:szCs w:val="24"/>
-              </w:rPr>
-              <w:t>)</w:t>
-            </w:r>
-            <w:r>
-              <w:rPr>
-                <w:rFonts w:ascii="Helvetica" w:hAnsi="Helvetica"/>
-                <w:sz w:val="24"/>
-                <w:szCs w:val="24"/>
-              </w:rPr>
-              <w:t xml:space="preserve"> }}</w:t>
+              <w:t>{{ redact(row.ssn) }}</w:t>
             </w:r>
           </w:p>
         </w:tc>
@@ -1362,7 +1274,7 @@
         </w:tc>
         <w:tc>
           <w:tcPr>
-            <w:tcW w:w="2610" w:type="dxa"/>
+            <w:tcW w:w="2611" w:type="dxa"/>
             <w:tcBorders>
               <w:right w:val="nil"/>
             </w:tcBorders>
@@ -1491,16 +1403,14 @@
         <w:tblLook w:val="04a0" w:noHBand="0" w:noVBand="1" w:firstColumn="1" w:lastRow="0" w:lastColumn="0" w:firstRow="1"/>
       </w:tblPr>
       <w:tblGrid>
-        <w:gridCol w:w="3240"/>
-        <w:gridCol w:w="2610"/>
-        <w:gridCol w:w="1621"/>
-        <w:gridCol w:w="1888"/>
+        <w:gridCol w:w="3960"/>
+        <w:gridCol w:w="3644"/>
       </w:tblGrid>
       <w:tr>
         <w:trPr/>
         <w:tc>
           <w:tcPr>
-            <w:tcW w:w="3240" w:type="dxa"/>
+            <w:tcW w:w="3960" w:type="dxa"/>
             <w:tcBorders/>
           </w:tcPr>
           <w:p>
@@ -1525,30 +1435,8 @@
                 <w:szCs w:val="24"/>
                 <w:lang w:val="en-US" w:eastAsia="en-US" w:bidi="ar-SA"/>
               </w:rPr>
-              <w:t>Name</w:t>
-            </w:r>
-          </w:p>
-        </w:tc>
-        <w:tc>
-          <w:tcPr>
-            <w:tcW w:w="2610" w:type="dxa"/>
-            <w:tcBorders>
-              <w:right w:val="nil"/>
-            </w:tcBorders>
-          </w:tcPr>
-          <w:p>
-            <w:pPr>
-              <w:pStyle w:val="Normal"/>
-              <w:widowControl w:val="false"/>
-              <w:suppressAutoHyphens w:val="true"/>
-              <w:spacing w:lineRule="auto" w:line="240" w:before="0" w:after="0"/>
-              <w:jc w:val="left"/>
-              <w:rPr>
-                <w:rFonts w:ascii="Helvetica" w:hAnsi="Helvetica"/>
-                <w:sz w:val="24"/>
-                <w:szCs w:val="24"/>
-              </w:rPr>
-            </w:pPr>
+              <w:t xml:space="preserve">Name </w:t>
+            </w:r>
             <w:r>
               <w:rPr>
                 <w:rFonts w:eastAsia="Calibri" w:cs="Arial" w:ascii="Helvetica" w:hAnsi="Helvetica"/>
@@ -1558,16 +1446,14 @@
                 <w:szCs w:val="24"/>
                 <w:lang w:val="en-US" w:eastAsia="en-US" w:bidi="ar-SA"/>
               </w:rPr>
-              <w:t>Date of Birth</w:t>
-            </w:r>
-          </w:p>
-        </w:tc>
-        <w:tc>
-          <w:tcPr>
-            <w:tcW w:w="1621" w:type="dxa"/>
-            <w:tcBorders>
-              <w:right w:val="nil"/>
-            </w:tcBorders>
+              <w:t>of Parent or Guardian</w:t>
+            </w:r>
+          </w:p>
+        </w:tc>
+        <w:tc>
+          <w:tcPr>
+            <w:tcW w:w="3644" w:type="dxa"/>
+            <w:tcBorders/>
           </w:tcPr>
           <w:p>
             <w:pPr>
@@ -1578,55 +1464,20 @@
               <w:jc w:val="left"/>
               <w:rPr>
                 <w:rFonts w:ascii="Helvetica" w:hAnsi="Helvetica"/>
+                <w:sz w:val="24"/>
+                <w:szCs w:val="24"/>
+              </w:rPr>
+            </w:pPr>
+            <w:r>
+              <w:rPr>
+                <w:rFonts w:eastAsia="Calibri" w:cs="Arial" w:ascii="Helvetica" w:hAnsi="Helvetica"/>
                 <w:b/>
-                <w:b/>
-                <w:bCs/>
-                <w:sz w:val="24"/>
-                <w:szCs w:val="24"/>
-              </w:rPr>
-            </w:pPr>
-            <w:r>
-              <w:rPr>
-                <w:rFonts w:ascii="Helvetica" w:hAnsi="Helvetica"/>
-                <w:b/>
-                <w:bCs/>
-                <w:sz w:val="24"/>
-                <w:szCs w:val="24"/>
-              </w:rPr>
-              <w:t>Sex</w:t>
-            </w:r>
-          </w:p>
-        </w:tc>
-        <w:tc>
-          <w:tcPr>
-            <w:tcW w:w="1888" w:type="dxa"/>
-            <w:tcBorders/>
-          </w:tcPr>
-          <w:p>
-            <w:pPr>
-              <w:pStyle w:val="Normal"/>
-              <w:widowControl w:val="false"/>
-              <w:suppressAutoHyphens w:val="true"/>
-              <w:spacing w:lineRule="auto" w:line="240" w:before="0" w:after="0"/>
-              <w:jc w:val="left"/>
-              <w:rPr>
-                <w:rFonts w:ascii="Helvetica" w:hAnsi="Helvetica"/>
-                <w:b/>
-                <w:b/>
-                <w:bCs/>
-                <w:sz w:val="24"/>
-                <w:szCs w:val="24"/>
-              </w:rPr>
-            </w:pPr>
-            <w:r>
-              <w:rPr>
-                <w:rFonts w:ascii="Helvetica" w:hAnsi="Helvetica"/>
-                <w:b/>
-                <w:bCs/>
-                <w:sz w:val="24"/>
-                <w:szCs w:val="24"/>
-              </w:rPr>
-              <w:t>SSN</w:t>
+                <w:kern w:val="0"/>
+                <w:sz w:val="24"/>
+                <w:szCs w:val="24"/>
+                <w:lang w:val="en-US" w:eastAsia="en-US" w:bidi="ar-SA"/>
+              </w:rPr>
+              <w:t>Address</w:t>
             </w:r>
           </w:p>
         </w:tc>
@@ -1635,7 +1486,7 @@
         <w:trPr/>
         <w:tc>
           <w:tcPr>
-            <w:tcW w:w="3240" w:type="dxa"/>
+            <w:tcW w:w="3960" w:type="dxa"/>
             <w:tcBorders/>
           </w:tcPr>
           <w:p>
@@ -1665,65 +1516,7 @@
         </w:tc>
         <w:tc>
           <w:tcPr>
-            <w:tcW w:w="2610" w:type="dxa"/>
-            <w:tcBorders>
-              <w:right w:val="nil"/>
-            </w:tcBorders>
-          </w:tcPr>
-          <w:p>
-            <w:pPr>
-              <w:pStyle w:val="Normal"/>
-              <w:widowControl w:val="false"/>
-              <w:suppressAutoHyphens w:val="true"/>
-              <w:spacing w:lineRule="auto" w:line="240" w:before="0" w:after="0"/>
-              <w:jc w:val="left"/>
-              <w:rPr>
-                <w:rFonts w:ascii="Helvetica" w:hAnsi="Helvetica" w:eastAsia="Calibri" w:cs="Arial"/>
-                <w:sz w:val="24"/>
-                <w:szCs w:val="24"/>
-              </w:rPr>
-            </w:pPr>
-            <w:r>
-              <w:rPr>
-                <w:rFonts w:eastAsia="Calibri" w:cs="Arial" w:ascii="Helvetica" w:hAnsi="Helvetica"/>
-                <w:sz w:val="24"/>
-                <w:szCs w:val="24"/>
-              </w:rPr>
-            </w:r>
-          </w:p>
-        </w:tc>
-        <w:tc>
-          <w:tcPr>
-            <w:tcW w:w="1621" w:type="dxa"/>
-            <w:tcBorders>
-              <w:right w:val="nil"/>
-            </w:tcBorders>
-          </w:tcPr>
-          <w:p>
-            <w:pPr>
-              <w:pStyle w:val="Normal"/>
-              <w:widowControl w:val="false"/>
-              <w:suppressAutoHyphens w:val="true"/>
-              <w:spacing w:lineRule="auto" w:line="240" w:before="0" w:after="0"/>
-              <w:jc w:val="left"/>
-              <w:rPr>
-                <w:rFonts w:ascii="Helvetica" w:hAnsi="Helvetica" w:eastAsia="Calibri" w:cs="Arial"/>
-                <w:sz w:val="24"/>
-                <w:szCs w:val="24"/>
-              </w:rPr>
-            </w:pPr>
-            <w:r>
-              <w:rPr>
-                <w:rFonts w:eastAsia="Calibri" w:cs="Arial" w:ascii="Helvetica" w:hAnsi="Helvetica"/>
-                <w:sz w:val="24"/>
-                <w:szCs w:val="24"/>
-              </w:rPr>
-            </w:r>
-          </w:p>
-        </w:tc>
-        <w:tc>
-          <w:tcPr>
-            <w:tcW w:w="1888" w:type="dxa"/>
+            <w:tcW w:w="3644" w:type="dxa"/>
             <w:tcBorders/>
           </w:tcPr>
           <w:p>
@@ -1753,7 +1546,7 @@
         <w:trPr/>
         <w:tc>
           <w:tcPr>
-            <w:tcW w:w="3240" w:type="dxa"/>
+            <w:tcW w:w="3960" w:type="dxa"/>
             <w:tcBorders/>
           </w:tcPr>
           <w:p>
@@ -1783,10 +1576,8 @@
         </w:tc>
         <w:tc>
           <w:tcPr>
-            <w:tcW w:w="2610" w:type="dxa"/>
-            <w:tcBorders>
-              <w:right w:val="nil"/>
-            </w:tcBorders>
+            <w:tcW w:w="3644" w:type="dxa"/>
+            <w:tcBorders/>
           </w:tcPr>
           <w:p>
             <w:pPr>
@@ -1810,63 +1601,6 @@
                 <w:lang w:val="en-US" w:eastAsia="en-US" w:bidi="ar-SA"/>
               </w:rPr>
               <w:t>{{ row.address.on_one_line() }}</w:t>
-            </w:r>
-          </w:p>
-        </w:tc>
-        <w:tc>
-          <w:tcPr>
-            <w:tcW w:w="1621" w:type="dxa"/>
-            <w:tcBorders>
-              <w:right w:val="nil"/>
-            </w:tcBorders>
-          </w:tcPr>
-          <w:p>
-            <w:pPr>
-              <w:pStyle w:val="Normal"/>
-              <w:widowControl w:val="false"/>
-              <w:suppressAutoHyphens w:val="true"/>
-              <w:spacing w:lineRule="auto" w:line="240" w:before="0" w:after="0"/>
-              <w:jc w:val="left"/>
-              <w:rPr>
-                <w:rFonts w:ascii="Helvetica" w:hAnsi="Helvetica"/>
-                <w:sz w:val="24"/>
-                <w:szCs w:val="24"/>
-              </w:rPr>
-            </w:pPr>
-            <w:r>
-              <w:rPr>
-                <w:rFonts w:ascii="Helvetica" w:hAnsi="Helvetica"/>
-                <w:sz w:val="24"/>
-                <w:szCs w:val="24"/>
-              </w:rPr>
-            </w:r>
-          </w:p>
-        </w:tc>
-        <w:tc>
-          <w:tcPr>
-            <w:tcW w:w="1888" w:type="dxa"/>
-            <w:tcBorders/>
-          </w:tcPr>
-          <w:p>
-            <w:pPr>
-              <w:pStyle w:val="Normal"/>
-              <w:widowControl w:val="false"/>
-              <w:suppressAutoHyphens w:val="true"/>
-              <w:spacing w:lineRule="auto" w:line="240" w:before="0" w:after="0"/>
-              <w:jc w:val="left"/>
-              <w:rPr>
-                <w:rFonts w:ascii="Helvetica" w:hAnsi="Helvetica"/>
-                <w:sz w:val="24"/>
-                <w:szCs w:val="24"/>
-              </w:rPr>
-            </w:pPr>
-            <w:r>
-              <w:rPr>
-                <w:rFonts w:ascii="Helvetica" w:hAnsi="Helvetica"/>
-                <w:sz w:val="24"/>
-                <w:szCs w:val="24"/>
-              </w:rPr>
-              <w:t/>
             </w:r>
           </w:p>
         </w:tc>
@@ -1875,7 +1609,7 @@
         <w:trPr/>
         <w:tc>
           <w:tcPr>
-            <w:tcW w:w="3240" w:type="dxa"/>
+            <w:tcW w:w="3960" w:type="dxa"/>
             <w:tcBorders/>
           </w:tcPr>
           <w:p>
@@ -1905,65 +1639,7 @@
         </w:tc>
         <w:tc>
           <w:tcPr>
-            <w:tcW w:w="2610" w:type="dxa"/>
-            <w:tcBorders>
-              <w:right w:val="nil"/>
-            </w:tcBorders>
-          </w:tcPr>
-          <w:p>
-            <w:pPr>
-              <w:pStyle w:val="Normal"/>
-              <w:widowControl w:val="false"/>
-              <w:suppressAutoHyphens w:val="true"/>
-              <w:spacing w:lineRule="auto" w:line="240" w:before="0" w:after="0"/>
-              <w:jc w:val="left"/>
-              <w:rPr>
-                <w:rFonts w:ascii="Helvetica" w:hAnsi="Helvetica" w:eastAsia="Calibri" w:cs="Arial"/>
-                <w:sz w:val="24"/>
-                <w:szCs w:val="24"/>
-              </w:rPr>
-            </w:pPr>
-            <w:r>
-              <w:rPr>
-                <w:rFonts w:eastAsia="Calibri" w:cs="Arial" w:ascii="Helvetica" w:hAnsi="Helvetica"/>
-                <w:sz w:val="24"/>
-                <w:szCs w:val="24"/>
-              </w:rPr>
-            </w:r>
-          </w:p>
-        </w:tc>
-        <w:tc>
-          <w:tcPr>
-            <w:tcW w:w="1621" w:type="dxa"/>
-            <w:tcBorders>
-              <w:right w:val="nil"/>
-            </w:tcBorders>
-          </w:tcPr>
-          <w:p>
-            <w:pPr>
-              <w:pStyle w:val="Normal"/>
-              <w:widowControl w:val="false"/>
-              <w:suppressAutoHyphens w:val="true"/>
-              <w:spacing w:lineRule="auto" w:line="240" w:before="0" w:after="0"/>
-              <w:jc w:val="left"/>
-              <w:rPr>
-                <w:rFonts w:ascii="Helvetica" w:hAnsi="Helvetica" w:eastAsia="Calibri" w:cs="Arial"/>
-                <w:sz w:val="24"/>
-                <w:szCs w:val="24"/>
-              </w:rPr>
-            </w:pPr>
-            <w:r>
-              <w:rPr>
-                <w:rFonts w:eastAsia="Calibri" w:cs="Arial" w:ascii="Helvetica" w:hAnsi="Helvetica"/>
-                <w:sz w:val="24"/>
-                <w:szCs w:val="24"/>
-              </w:rPr>
-            </w:r>
-          </w:p>
-        </w:tc>
-        <w:tc>
-          <w:tcPr>
-            <w:tcW w:w="1888" w:type="dxa"/>
+            <w:tcW w:w="3644" w:type="dxa"/>
             <w:tcBorders/>
           </w:tcPr>
           <w:p>

</xml_diff>